<commit_message>
Expand lineage to 19 new RPT tables; fix shell parser/combiner/graph bugs
</commit_message>
<xml_diff>
--- a/docs/RSL_EDP_Agentic_Setup_Code_Optimization.docx
+++ b/docs/RSL_EDP_Agentic_Setup_Code_Optimization.docx
@@ -1,6 +1,6 @@
 
 <file path=word/document.xml><?xml version="1.0" encoding="utf-8"?>
-<w:document xmlns:wpc="http://schemas.microsoft.com/office/word/2010/wordprocessingCanvas" xmlns:cx="http://schemas.microsoft.com/office/drawing/2014/chartex" xmlns:cx1="http://schemas.microsoft.com/office/drawing/2015/9/8/chartex" xmlns:cx2="http://schemas.microsoft.com/office/drawing/2015/10/21/chartex" xmlns:cx3="http://schemas.microsoft.com/office/drawing/2016/5/9/chartex" xmlns:cx4="http://schemas.microsoft.com/office/drawing/2016/5/10/chartex" xmlns:cx5="http://schemas.microsoft.com/office/drawing/2016/5/11/chartex" xmlns:cx6="http://schemas.microsoft.com/office/drawing/2016/5/12/chartex" xmlns:cx7="http://schemas.microsoft.com/office/drawing/2016/5/13/chartex" xmlns:cx8="http://schemas.microsoft.com/office/drawing/2016/5/14/chartex" xmlns:mc="http://schemas.openxmlformats.org/markup-compatibility/2006" xmlns:aink="http://schemas.microsoft.com/office/drawing/2016/ink" xmlns:am3d="http://schemas.microsoft.com/office/drawing/2017/model3d" xmlns:o="urn:schemas-microsoft-com:office:office" xmlns:oel="http://schemas.microsoft.com/office/2019/extlst" xmlns:r="http://schemas.openxmlformats.org/officeDocument/2006/relationships" xmlns:m="http://schemas.openxmlformats.org/officeDocument/2006/math" xmlns:v="urn:schemas-microsoft-com:vml" xmlns:wp14="http://schemas.microsoft.com/office/word/2010/wordprocessingDrawing" xmlns:wp="http://schemas.openxmlformats.org/drawingml/2006/wordprocessingDrawing" xmlns:w10="urn:schemas-microsoft-com:office:word" xmlns:w="http://schemas.openxmlformats.org/wordprocessingml/2006/main" xmlns:w14="http://schemas.microsoft.com/office/word/2010/wordml" xmlns:w15="http://schemas.microsoft.com/office/word/2012/wordml" xmlns:w16cex="http://schemas.microsoft.com/office/word/2018/wordml/cex" xmlns:w16cid="http://schemas.microsoft.com/office/word/2016/wordml/cid" xmlns:w16="http://schemas.microsoft.com/office/word/2018/wordml" xmlns:w16du="http://schemas.microsoft.com/office/word/2023/wordml/word16du" xmlns:w16sdtdh="http://schemas.microsoft.com/office/word/2020/wordml/sdtdatahash" xmlns:w16sdtfl="http://schemas.microsoft.com/office/word/2024/wordml/sdtformatlock" xmlns:w16se="http://schemas.microsoft.com/office/word/2015/wordml/symex" xmlns:wpg="http://schemas.microsoft.com/office/word/2010/wordprocessingGroup" xmlns:wpi="http://schemas.microsoft.com/office/word/2010/wordprocessingInk" xmlns:wne="http://schemas.microsoft.com/office/word/2006/wordml" xmlns:wps="http://schemas.microsoft.com/office/word/2010/wordprocessingShape" mc:Ignorable="w14 w15 w16se w16cid w16 w16cex w16sdtdh w16sdtfl w16du wp14">
+<w:document xmlns:wpc="http://schemas.microsoft.com/office/word/2010/wordprocessingCanvas" xmlns:cx="http://schemas.microsoft.com/office/drawing/2014/chartex" xmlns:cx1="http://schemas.microsoft.com/office/drawing/2015/9/8/chartex" xmlns:cx2="http://schemas.microsoft.com/office/drawing/2015/10/21/chartex" xmlns:cx3="http://schemas.microsoft.com/office/drawing/2016/5/9/chartex" xmlns:cx4="http://schemas.microsoft.com/office/drawing/2016/5/10/chartex" xmlns:cx5="http://schemas.microsoft.com/office/drawing/2016/5/11/chartex" xmlns:cx6="http://schemas.microsoft.com/office/drawing/2016/5/12/chartex" xmlns:cx7="http://schemas.microsoft.com/office/drawing/2016/5/13/chartex" xmlns:cx8="http://schemas.microsoft.com/office/drawing/2016/5/14/chartex" xmlns:mc="http://schemas.openxmlformats.org/markup-compatibility/2006" xmlns:aink="http://schemas.microsoft.com/office/drawing/2016/ink" xmlns:am3d="http://schemas.microsoft.com/office/drawing/2017/model3d" xmlns:o="urn:schemas-microsoft-com:office:office" xmlns:oel="http://schemas.microsoft.com/office/2019/extlst" xmlns:r="http://schemas.openxmlformats.org/officeDocument/2006/relationships" xmlns:m="http://schemas.openxmlformats.org/officeDocument/2006/math" xmlns:v="urn:schemas-microsoft-com:vml" xmlns:wp14="http://schemas.microsoft.com/office/word/2010/wordprocessingDrawing" xmlns:wp="http://schemas.openxmlformats.org/drawingml/2006/wordprocessingDrawing" xmlns:w10="urn:schemas-microsoft-com:office:word" xmlns:w="http://schemas.openxmlformats.org/wordprocessingml/2006/main" xmlns:w14="http://schemas.microsoft.com/office/word/2010/wordml" xmlns:w15="http://schemas.microsoft.com/office/word/2012/wordml" xmlns:w16cei="http://schemas.microsoft.com/office/word/2026/wordml/cei" xmlns:w16cex="http://schemas.microsoft.com/office/word/2018/wordml/cex" xmlns:w16cid="http://schemas.microsoft.com/office/word/2016/wordml/cid" xmlns:w16="http://schemas.microsoft.com/office/word/2018/wordml" xmlns:w16du="http://schemas.microsoft.com/office/word/2023/wordml/word16du" xmlns:w16sdtdh="http://schemas.microsoft.com/office/word/2020/wordml/sdtdatahash" xmlns:w16sdtfl="http://schemas.microsoft.com/office/word/2024/wordml/sdtformatlock" xmlns:w16se="http://schemas.microsoft.com/office/word/2015/wordml/symex" xmlns:wpg="http://schemas.microsoft.com/office/word/2010/wordprocessingGroup" xmlns:wpi="http://schemas.microsoft.com/office/word/2010/wordprocessingInk" xmlns:wne="http://schemas.microsoft.com/office/word/2006/wordml" xmlns:wps="http://schemas.microsoft.com/office/word/2010/wordprocessingShape" mc:Ignorable="w14 w15 w16se w16cid w16 w16cex w16sdtdh w16sdtfl w16du wp14">
   <w:body>
     <w:p>
       <w:pPr>
@@ -1042,7 +1042,16 @@
             <w:vAlign w:val="center"/>
           </w:tcPr>
           <w:p>
-            <w:r>
+            <w:pPr>
+              <w:spacing w:before="30" w:after="30"/>
+              <w:rPr>
+                <w:sz w:val="18"/>
+              </w:rPr>
+            </w:pPr>
+            <w:r>
+              <w:rPr>
+                <w:sz w:val="18"/>
+              </w:rPr>
               <w:t>PL/SQL Documenter</w:t>
             </w:r>
           </w:p>
@@ -1054,7 +1063,16 @@
             <w:vAlign w:val="center"/>
           </w:tcPr>
           <w:p>
-            <w:r>
+            <w:pPr>
+              <w:spacing w:before="30" w:after="30"/>
+              <w:rPr>
+                <w:sz w:val="18"/>
+              </w:rPr>
+            </w:pPr>
+            <w:r>
+              <w:rPr>
+                <w:sz w:val="18"/>
+              </w:rPr>
               <w:t>User-invocable</w:t>
             </w:r>
           </w:p>
@@ -1066,7 +1084,16 @@
             <w:vAlign w:val="center"/>
           </w:tcPr>
           <w:p>
-            <w:r>
+            <w:pPr>
+              <w:spacing w:before="30" w:after="30"/>
+              <w:rPr>
+                <w:sz w:val="18"/>
+              </w:rPr>
+            </w:pPr>
+            <w:r>
+              <w:rPr>
+                <w:sz w:val="18"/>
+              </w:rPr>
               <w:t>Stage 4</w:t>
             </w:r>
           </w:p>
@@ -1078,7 +1105,16 @@
             <w:vAlign w:val="center"/>
           </w:tcPr>
           <w:p>
-            <w:r>
+            <w:pPr>
+              <w:spacing w:before="30" w:after="30"/>
+              <w:rPr>
+                <w:sz w:val="18"/>
+              </w:rPr>
+            </w:pPr>
+            <w:r>
+              <w:rPr>
+                <w:sz w:val="18"/>
+              </w:rPr>
               <w:t>Generates 04_package_documentation.md (technical reference) and 04_change_log.md (before-vs-after change log mapped to rec IDs).</w:t>
             </w:r>
           </w:p>
@@ -1677,6 +1713,7 @@
         </w:tc>
       </w:tr>
     </w:tbl>
+    <w:p/>
     <w:p/>
     <w:p>
       <w:pPr>
@@ -1691,6 +1728,7 @@
           <w:color w:val="1A1A24"/>
           <w:sz w:val="36"/>
         </w:rPr>
+        <w:lastRenderedPageBreak/>
         <w:t>4.  Pipeline Flow</w:t>
       </w:r>
     </w:p>
@@ -1726,9 +1764,9 @@
       </w:tblPr>
       <w:tblGrid>
         <w:gridCol w:w="660"/>
-        <w:gridCol w:w="2148"/>
-        <w:gridCol w:w="1440"/>
-        <w:gridCol w:w="5328"/>
+        <w:gridCol w:w="2699"/>
+        <w:gridCol w:w="1432"/>
+        <w:gridCol w:w="5217"/>
       </w:tblGrid>
       <w:tr>
         <w:tc>
@@ -2218,7 +2256,16 @@
             <w:vAlign w:val="center"/>
           </w:tcPr>
           <w:p>
-            <w:r>
+            <w:pPr>
+              <w:spacing w:before="30" w:after="30"/>
+              <w:rPr>
+                <w:sz w:val="18"/>
+              </w:rPr>
+            </w:pPr>
+            <w:r>
+              <w:rPr>
+                <w:sz w:val="18"/>
+              </w:rPr>
               <w:t>4</w:t>
             </w:r>
           </w:p>
@@ -2230,10 +2277,29 @@
             <w:vAlign w:val="center"/>
           </w:tcPr>
           <w:p>
-            <w:r>
+            <w:pPr>
+              <w:spacing w:before="30" w:after="30"/>
+              <w:rPr>
+                <w:sz w:val="18"/>
+              </w:rPr>
+            </w:pPr>
+            <w:r>
+              <w:rPr>
+                <w:sz w:val="18"/>
+              </w:rPr>
               <w:t>Document</w:t>
+            </w:r>
+            <w:r>
+              <w:rPr>
+                <w:sz w:val="18"/>
+              </w:rPr>
               <w:br/>
               <w:t>(04_package_documentation.md</w:t>
+            </w:r>
+            <w:r>
+              <w:rPr>
+                <w:sz w:val="18"/>
+              </w:rPr>
               <w:br/>
               <w:t>+ 04_change_log.md)</w:t>
             </w:r>
@@ -2246,7 +2312,16 @@
             <w:vAlign w:val="center"/>
           </w:tcPr>
           <w:p>
-            <w:r>
+            <w:pPr>
+              <w:spacing w:before="30" w:after="30"/>
+              <w:rPr>
+                <w:sz w:val="18"/>
+              </w:rPr>
+            </w:pPr>
+            <w:r>
+              <w:rPr>
+                <w:sz w:val="18"/>
+              </w:rPr>
               <w:t>Documenter</w:t>
             </w:r>
           </w:p>
@@ -2258,7 +2333,16 @@
             <w:vAlign w:val="center"/>
           </w:tcPr>
           <w:p>
-            <w:r>
+            <w:pPr>
+              <w:spacing w:before="30" w:after="30"/>
+              <w:rPr>
+                <w:sz w:val="18"/>
+              </w:rPr>
+            </w:pPr>
+            <w:r>
+              <w:rPr>
+                <w:sz w:val="18"/>
+              </w:rPr>
               <w:t>Read best available stage file (03_standardized.sql → 02_optimized.sql → 01_merged.sql). Generate comprehensive technical reference and before-vs-after change log mapped to rec IDs.</w:t>
             </w:r>
           </w:p>
@@ -2707,7 +2791,16 @@
             <w:vAlign w:val="center"/>
           </w:tcPr>
           <w:p>
-            <w:r>
+            <w:pPr>
+              <w:spacing w:before="30" w:after="30"/>
+              <w:rPr>
+                <w:sz w:val="18"/>
+              </w:rPr>
+            </w:pPr>
+            <w:r>
+              <w:rPr>
+                <w:sz w:val="18"/>
+              </w:rPr>
               <w:t>04_package_documentation.md</w:t>
             </w:r>
           </w:p>
@@ -2719,7 +2812,16 @@
             <w:vAlign w:val="center"/>
           </w:tcPr>
           <w:p>
-            <w:r>
+            <w:pPr>
+              <w:spacing w:before="30" w:after="30"/>
+              <w:rPr>
+                <w:sz w:val="18"/>
+              </w:rPr>
+            </w:pPr>
+            <w:r>
+              <w:rPr>
+                <w:sz w:val="18"/>
+              </w:rPr>
               <w:t>Stage 4</w:t>
             </w:r>
           </w:p>
@@ -2731,7 +2833,16 @@
             <w:vAlign w:val="center"/>
           </w:tcPr>
           <w:p>
-            <w:r>
+            <w:pPr>
+              <w:spacing w:before="30" w:after="30"/>
+              <w:rPr>
+                <w:sz w:val="18"/>
+              </w:rPr>
+            </w:pPr>
+            <w:r>
+              <w:rPr>
+                <w:sz w:val="18"/>
+              </w:rPr>
               <w:t>Comprehensive technical reference for the package — object inventory, SQL objects, data flow diagram, performance characteristics, and registry rec summary.</w:t>
             </w:r>
           </w:p>
@@ -2745,7 +2856,16 @@
             <w:vAlign w:val="center"/>
           </w:tcPr>
           <w:p>
-            <w:r>
+            <w:pPr>
+              <w:spacing w:before="30" w:after="30"/>
+              <w:rPr>
+                <w:sz w:val="18"/>
+              </w:rPr>
+            </w:pPr>
+            <w:r>
+              <w:rPr>
+                <w:sz w:val="18"/>
+              </w:rPr>
               <w:t>04_change_log.md</w:t>
             </w:r>
           </w:p>
@@ -2757,7 +2877,16 @@
             <w:vAlign w:val="center"/>
           </w:tcPr>
           <w:p>
-            <w:r>
+            <w:pPr>
+              <w:spacing w:before="30" w:after="30"/>
+              <w:rPr>
+                <w:sz w:val="18"/>
+              </w:rPr>
+            </w:pPr>
+            <w:r>
+              <w:rPr>
+                <w:sz w:val="18"/>
+              </w:rPr>
               <w:t>Stage 4</w:t>
             </w:r>
           </w:p>
@@ -2769,7 +2898,16 @@
             <w:vAlign w:val="center"/>
           </w:tcPr>
           <w:p>
-            <w:r>
+            <w:pPr>
+              <w:spacing w:before="30" w:after="30"/>
+              <w:rPr>
+                <w:sz w:val="18"/>
+              </w:rPr>
+            </w:pPr>
+            <w:r>
+              <w:rPr>
+                <w:sz w:val="18"/>
+              </w:rPr>
               <w:t>Before-vs-after change log: every structural change mapped to a rec ID with impact metrics and rollback guidance.</w:t>
             </w:r>
           </w:p>
@@ -2938,7 +3076,14 @@
               <w:rPr>
                 <w:sz w:val="18"/>
               </w:rPr>
-              <w:t>Human-readable plan written before any code is touched; updated at each stage</w:t>
+              <w:t xml:space="preserve">Human-readable plan written before any code is touched; </w:t>
+            </w:r>
+            <w:r>
+              <w:rPr>
+                <w:sz w:val="18"/>
+              </w:rPr>
+              <w:lastRenderedPageBreak/>
+              <w:t>updated at each stage</w:t>
             </w:r>
           </w:p>
         </w:tc>
@@ -3175,7 +3320,6 @@
               <w:rPr>
                 <w:sz w:val="18"/>
               </w:rPr>
-              <w:lastRenderedPageBreak/>
               <w:t>Phase 1</w:t>
             </w:r>
           </w:p>
@@ -4065,7 +4209,14 @@
               <w:rPr>
                 <w:sz w:val="18"/>
               </w:rPr>
-              <w:t>Serial Tidal job chains with no data dependency noted in decisions.md for Tidal team action. No SQL change.</w:t>
+              <w:t xml:space="preserve">Serial Tidal job chains with no data dependency noted in decisions.md for Tidal </w:t>
+            </w:r>
+            <w:r>
+              <w:rPr>
+                <w:sz w:val="18"/>
+              </w:rPr>
+              <w:lastRenderedPageBreak/>
+              <w:t>team action. No SQL change.</w:t>
             </w:r>
           </w:p>
         </w:tc>
@@ -4085,6 +4236,7 @@
               <w:rPr>
                 <w:sz w:val="18"/>
               </w:rPr>
+              <w:lastRenderedPageBreak/>
               <w:t>Tidal only</w:t>
             </w:r>
           </w:p>
@@ -4293,14 +4445,7 @@
               <w:rPr>
                 <w:sz w:val="18"/>
               </w:rPr>
-              <w:t xml:space="preserve">Row-by-row loops with DML, SELECT inside loops, BULK COLLECT without LIMIT, dynamic SQL without bind variables, unused variables, dead code, bare WHEN OTHERS </w:t>
-            </w:r>
-            <w:r>
-              <w:rPr>
-                <w:sz w:val="18"/>
-              </w:rPr>
-              <w:lastRenderedPageBreak/>
-              <w:t>THEN NULL.</w:t>
+              <w:t>Row-by-row loops with DML, SELECT inside loops, BULK COLLECT without LIMIT, dynamic SQL without bind variables, unused variables, dead code, bare WHEN OTHERS THEN NULL.</w:t>
             </w:r>
           </w:p>
         </w:tc>
@@ -4320,7 +4465,6 @@
               <w:rPr>
                 <w:sz w:val="18"/>
               </w:rPr>
-              <w:lastRenderedPageBreak/>
               <w:t>Cursor Consolidation</w:t>
             </w:r>
           </w:p>
@@ -4642,6 +4786,7 @@
         <w:rPr>
           <w:sz w:val="20"/>
         </w:rPr>
+        <w:lastRenderedPageBreak/>
         <w:t>If a Phase 1 naming rec renames table X, and a Phase 2/3 rec references X in a cursor or JOIN pattern, the rename must be applied first. Merger processes recs in phase order automatically — this compound is always handled correctly.</w:t>
       </w:r>
     </w:p>
@@ -4828,7 +4973,6 @@
               <w:rPr>
                 <w:sz w:val="18"/>
               </w:rPr>
-              <w:lastRenderedPageBreak/>
               <w:t>Option A</w:t>
             </w:r>
           </w:p>
@@ -5685,6 +5829,7 @@
                 <w:color w:val="FFFFFF"/>
                 <w:sz w:val="18"/>
               </w:rPr>
+              <w:lastRenderedPageBreak/>
               <w:t>Agent</w:t>
             </w:r>
           </w:p>
@@ -6137,7 +6282,6 @@
               <w:rPr>
                 <w:sz w:val="18"/>
               </w:rPr>
-              <w:lastRenderedPageBreak/>
               <w:t>Any</w:t>
             </w:r>
           </w:p>
@@ -6346,6 +6490,9 @@
           <w:p>
             <w:pPr>
               <w:spacing w:before="30" w:after="30"/>
+              <w:rPr>
+                <w:sz w:val="18"/>
+              </w:rPr>
             </w:pPr>
             <w:r>
               <w:rPr>
@@ -6362,7 +6509,15 @@
             <w:vAlign w:val="center"/>
           </w:tcPr>
           <w:p>
-            <w:r>
+            <w:pPr>
+              <w:rPr>
+                <w:sz w:val="18"/>
+              </w:rPr>
+            </w:pPr>
+            <w:r>
+              <w:rPr>
+                <w:sz w:val="18"/>
+              </w:rPr>
               <w:t>Current state: raw → merged → optimized → standardized → documented.</w:t>
             </w:r>
           </w:p>
@@ -6909,6 +7064,7 @@
           <w:color w:val="1A1A24"/>
           <w:sz w:val="36"/>
         </w:rPr>
+        <w:lastRenderedPageBreak/>
         <w:t>12.  Glossary</w:t>
       </w:r>
     </w:p>
@@ -6919,7 +7075,7 @@
         <w:tblLook w:val="04A0" w:firstRow="1" w:lastRow="0" w:firstColumn="1" w:lastColumn="0" w:noHBand="0" w:noVBand="1"/>
       </w:tblPr>
       <w:tblGrid>
-        <w:gridCol w:w="2160"/>
+        <w:gridCol w:w="2630"/>
         <w:gridCol w:w="7200"/>
       </w:tblGrid>
       <w:tr>
@@ -7225,14 +7381,7 @@
               <w:rPr>
                 <w:sz w:val="18"/>
               </w:rPr>
-              <w:t xml:space="preserve">Oracle Global Temporary Table. Data is session-scoped. In this codebase, GTTs are used for </w:t>
-            </w:r>
-            <w:r>
-              <w:rPr>
-                <w:sz w:val="18"/>
-              </w:rPr>
-              <w:lastRenderedPageBreak/>
-              <w:t>intra-procedure staging — loaded in one step, consumed in cursor updates.</w:t>
+              <w:t>Oracle Global Temporary Table. Data is session-scoped. In this codebase, GTTs are used for intra-procedure staging — loaded in one step, consumed in cursor updates.</w:t>
             </w:r>
           </w:p>
         </w:tc>
@@ -7252,7 +7401,6 @@
               <w:rPr>
                 <w:sz w:val="18"/>
               </w:rPr>
-              <w:lastRenderedPageBreak/>
               <w:t>BULK COLLECT</w:t>
             </w:r>
           </w:p>
@@ -7474,7 +7622,16 @@
             <w:vAlign w:val="center"/>
           </w:tcPr>
           <w:p>
-            <w:r>
+            <w:pPr>
+              <w:spacing w:before="30" w:after="30"/>
+              <w:rPr>
+                <w:sz w:val="18"/>
+              </w:rPr>
+            </w:pPr>
+            <w:r>
+              <w:rPr>
+                <w:sz w:val="18"/>
+              </w:rPr>
               <w:t>04_package_documentation.md</w:t>
             </w:r>
           </w:p>
@@ -7486,7 +7643,16 @@
             <w:vAlign w:val="center"/>
           </w:tcPr>
           <w:p>
-            <w:r>
+            <w:pPr>
+              <w:spacing w:before="30" w:after="30"/>
+              <w:rPr>
+                <w:sz w:val="18"/>
+              </w:rPr>
+            </w:pPr>
+            <w:r>
+              <w:rPr>
+                <w:sz w:val="18"/>
+              </w:rPr>
               <w:t>The technical reference document produced by PL/SQL Documenter for every pipeline package. Contains object inventory, data flow, SQL object references, performance characteristics, and registry rec summary.</w:t>
             </w:r>
           </w:p>
@@ -7500,7 +7666,16 @@
             <w:vAlign w:val="center"/>
           </w:tcPr>
           <w:p>
-            <w:r>
+            <w:pPr>
+              <w:spacing w:before="30" w:after="30"/>
+              <w:rPr>
+                <w:sz w:val="18"/>
+              </w:rPr>
+            </w:pPr>
+            <w:r>
+              <w:rPr>
+                <w:sz w:val="18"/>
+              </w:rPr>
               <w:t>04_change_log.md</w:t>
             </w:r>
           </w:p>
@@ -7512,7 +7687,16 @@
             <w:vAlign w:val="center"/>
           </w:tcPr>
           <w:p>
-            <w:r>
+            <w:pPr>
+              <w:spacing w:before="30" w:after="30"/>
+              <w:rPr>
+                <w:sz w:val="18"/>
+              </w:rPr>
+            </w:pPr>
+            <w:r>
+              <w:rPr>
+                <w:sz w:val="18"/>
+              </w:rPr>
               <w:t>The before-vs-after change log produced by PL/SQL Documenter. Maps every structural change to a rec ID with impact metrics and rollback guidance.</w:t>
             </w:r>
           </w:p>
@@ -7544,7 +7728,7 @@
 </file>
 
 <file path=word/numbering.xml><?xml version="1.0" encoding="utf-8"?>
-<w:numbering xmlns:wpc="http://schemas.microsoft.com/office/word/2010/wordprocessingCanvas" xmlns:cx="http://schemas.microsoft.com/office/drawing/2014/chartex" xmlns:cx1="http://schemas.microsoft.com/office/drawing/2015/9/8/chartex" xmlns:cx2="http://schemas.microsoft.com/office/drawing/2015/10/21/chartex" xmlns:cx3="http://schemas.microsoft.com/office/drawing/2016/5/9/chartex" xmlns:cx4="http://schemas.microsoft.com/office/drawing/2016/5/10/chartex" xmlns:cx5="http://schemas.microsoft.com/office/drawing/2016/5/11/chartex" xmlns:cx6="http://schemas.microsoft.com/office/drawing/2016/5/12/chartex" xmlns:cx7="http://schemas.microsoft.com/office/drawing/2016/5/13/chartex" xmlns:cx8="http://schemas.microsoft.com/office/drawing/2016/5/14/chartex" xmlns:mc="http://schemas.openxmlformats.org/markup-compatibility/2006" xmlns:aink="http://schemas.microsoft.com/office/drawing/2016/ink" xmlns:am3d="http://schemas.microsoft.com/office/drawing/2017/model3d" xmlns:o="urn:schemas-microsoft-com:office:office" xmlns:oel="http://schemas.microsoft.com/office/2019/extlst" xmlns:r="http://schemas.openxmlformats.org/officeDocument/2006/relationships" xmlns:m="http://schemas.openxmlformats.org/officeDocument/2006/math" xmlns:v="urn:schemas-microsoft-com:vml" xmlns:wp14="http://schemas.microsoft.com/office/word/2010/wordprocessingDrawing" xmlns:wp="http://schemas.openxmlformats.org/drawingml/2006/wordprocessingDrawing" xmlns:w10="urn:schemas-microsoft-com:office:word" xmlns:w="http://schemas.openxmlformats.org/wordprocessingml/2006/main" xmlns:w14="http://schemas.microsoft.com/office/word/2010/wordml" xmlns:w15="http://schemas.microsoft.com/office/word/2012/wordml" xmlns:w16cex="http://schemas.microsoft.com/office/word/2018/wordml/cex" xmlns:w16cid="http://schemas.microsoft.com/office/word/2016/wordml/cid" xmlns:w16="http://schemas.microsoft.com/office/word/2018/wordml" xmlns:w16du="http://schemas.microsoft.com/office/word/2023/wordml/word16du" xmlns:w16sdtdh="http://schemas.microsoft.com/office/word/2020/wordml/sdtdatahash" xmlns:w16sdtfl="http://schemas.microsoft.com/office/word/2024/wordml/sdtformatlock" xmlns:w16se="http://schemas.microsoft.com/office/word/2015/wordml/symex" xmlns:wpg="http://schemas.microsoft.com/office/word/2010/wordprocessingGroup" xmlns:wpi="http://schemas.microsoft.com/office/word/2010/wordprocessingInk" xmlns:wne="http://schemas.microsoft.com/office/word/2006/wordml" xmlns:wps="http://schemas.microsoft.com/office/word/2010/wordprocessingShape" mc:Ignorable="w14 w15 w16se w16cid w16 w16cex w16sdtdh w16sdtfl w16du wp14">
+<w:numbering xmlns:wpc="http://schemas.microsoft.com/office/word/2010/wordprocessingCanvas" xmlns:cx="http://schemas.microsoft.com/office/drawing/2014/chartex" xmlns:cx1="http://schemas.microsoft.com/office/drawing/2015/9/8/chartex" xmlns:cx2="http://schemas.microsoft.com/office/drawing/2015/10/21/chartex" xmlns:cx3="http://schemas.microsoft.com/office/drawing/2016/5/9/chartex" xmlns:cx4="http://schemas.microsoft.com/office/drawing/2016/5/10/chartex" xmlns:cx5="http://schemas.microsoft.com/office/drawing/2016/5/11/chartex" xmlns:cx6="http://schemas.microsoft.com/office/drawing/2016/5/12/chartex" xmlns:cx7="http://schemas.microsoft.com/office/drawing/2016/5/13/chartex" xmlns:cx8="http://schemas.microsoft.com/office/drawing/2016/5/14/chartex" xmlns:mc="http://schemas.openxmlformats.org/markup-compatibility/2006" xmlns:aink="http://schemas.microsoft.com/office/drawing/2016/ink" xmlns:am3d="http://schemas.microsoft.com/office/drawing/2017/model3d" xmlns:o="urn:schemas-microsoft-com:office:office" xmlns:oel="http://schemas.microsoft.com/office/2019/extlst" xmlns:r="http://schemas.openxmlformats.org/officeDocument/2006/relationships" xmlns:m="http://schemas.openxmlformats.org/officeDocument/2006/math" xmlns:v="urn:schemas-microsoft-com:vml" xmlns:wp14="http://schemas.microsoft.com/office/word/2010/wordprocessingDrawing" xmlns:wp="http://schemas.openxmlformats.org/drawingml/2006/wordprocessingDrawing" xmlns:w10="urn:schemas-microsoft-com:office:word" xmlns:w="http://schemas.openxmlformats.org/wordprocessingml/2006/main" xmlns:w14="http://schemas.microsoft.com/office/word/2010/wordml" xmlns:w15="http://schemas.microsoft.com/office/word/2012/wordml" xmlns:w16cei="http://schemas.microsoft.com/office/word/2026/wordml/cei" xmlns:w16cex="http://schemas.microsoft.com/office/word/2018/wordml/cex" xmlns:w16cid="http://schemas.microsoft.com/office/word/2016/wordml/cid" xmlns:w16="http://schemas.microsoft.com/office/word/2018/wordml" xmlns:w16du="http://schemas.microsoft.com/office/word/2023/wordml/word16du" xmlns:w16sdtdh="http://schemas.microsoft.com/office/word/2020/wordml/sdtdatahash" xmlns:w16sdtfl="http://schemas.microsoft.com/office/word/2024/wordml/sdtformatlock" xmlns:w16se="http://schemas.microsoft.com/office/word/2015/wordml/symex" xmlns:wpg="http://schemas.microsoft.com/office/word/2010/wordprocessingGroup" xmlns:wpi="http://schemas.microsoft.com/office/word/2010/wordprocessingInk" xmlns:wne="http://schemas.microsoft.com/office/word/2006/wordml" xmlns:wps="http://schemas.microsoft.com/office/word/2010/wordprocessingShape" mc:Ignorable="w14 w15 w16se w16cid w16 w16cex w16sdtdh w16sdtfl w16du wp14">
   <w:abstractNum w:abstractNumId="0" w15:restartNumberingAfterBreak="0">
     <w:nsid w:val="FFFFFF7C"/>
     <w:multiLevelType w:val="singleLevel"/>
@@ -19459,4 +19643,10 @@
     <ds:schemaRef ds:uri="http://schemas.openxmlformats.org/officeDocument/2006/bibliography"/>
   </ds:schemaRefs>
 </ds:datastoreItem>
+</file>
+
+<file path=docMetadata/LabelInfo.xml><?xml version="1.0" encoding="utf-8"?>
+<clbl:labelList xmlns:clbl="http://schemas.microsoft.com/office/2020/mipLabelMetadata">
+  <clbl:label id="{a12760ca-cea2-4c03-9ac6-6aa5ecb49e43}" enabled="0" method="" siteId="{a12760ca-cea2-4c03-9ac6-6aa5ecb49e43}" removed="1"/>
+</clbl:labelList>
 </file>
</xml_diff>